<commit_message>
updted git link in document
</commit_message>
<xml_diff>
--- a/Assignment 2.docx
+++ b/Assignment 2.docx
@@ -399,7 +399,23 @@
           <w:rFonts w:asciiTheme="majorBidi" w:hAnsiTheme="majorBidi" w:cstheme="majorBidi"/>
           <w:szCs w:val="28"/>
         </w:rPr>
-        <w:t>Please submit the submission file(s) through Learn@Seneca.</w:t>
+        <w:t xml:space="preserve">Please submit the submission file(s) through </w:t>
+      </w:r>
+      <w:proofErr w:type="spellStart"/>
+      <w:r>
+        <w:rPr>
+          <w:rFonts w:asciiTheme="majorBidi" w:hAnsiTheme="majorBidi" w:cstheme="majorBidi"/>
+          <w:szCs w:val="28"/>
+        </w:rPr>
+        <w:t>Learn@Seneca</w:t>
+      </w:r>
+      <w:proofErr w:type="spellEnd"/>
+      <w:r>
+        <w:rPr>
+          <w:rFonts w:asciiTheme="majorBidi" w:hAnsiTheme="majorBidi" w:cstheme="majorBidi"/>
+          <w:szCs w:val="28"/>
+        </w:rPr>
+        <w:t>.</w:t>
       </w:r>
       <w:r>
         <w:rPr>
@@ -464,6 +480,30 @@
                 <w:szCs w:val="28"/>
               </w:rPr>
             </w:pPr>
+            <w:hyperlink r:id="rId5" w:history="1">
+              <w:proofErr w:type="spellStart"/>
+              <w:r>
+                <w:rPr>
+                  <w:rStyle w:val="Hyperlink"/>
+                  <w:rFonts w:asciiTheme="majorBidi" w:hAnsiTheme="majorBidi" w:cstheme="majorBidi"/>
+                  <w:sz w:val="24"/>
+                  <w:szCs w:val="28"/>
+                  <w:lang w:val="en-CA"/>
+                </w:rPr>
+                <w:t>justin-sanpedro</w:t>
+              </w:r>
+              <w:proofErr w:type="spellEnd"/>
+              <w:r>
+                <w:rPr>
+                  <w:rStyle w:val="Hyperlink"/>
+                  <w:rFonts w:asciiTheme="majorBidi" w:hAnsiTheme="majorBidi" w:cstheme="majorBidi"/>
+                  <w:sz w:val="24"/>
+                  <w:szCs w:val="28"/>
+                  <w:lang w:val="en-CA"/>
+                </w:rPr>
+                <w:t>/CV1620_Assignment2 at master</w:t>
+              </w:r>
+            </w:hyperlink>
           </w:p>
         </w:tc>
       </w:tr>
@@ -1031,7 +1071,7 @@
                     <pic:cNvPicPr/>
                   </pic:nvPicPr>
                   <pic:blipFill>
-                    <a:blip r:embed="rId5"/>
+                    <a:blip r:embed="rId6"/>
                     <a:stretch>
                       <a:fillRect/>
                     </a:stretch>
@@ -1115,7 +1155,7 @@
                     <pic:cNvPicPr/>
                   </pic:nvPicPr>
                   <pic:blipFill>
-                    <a:blip r:embed="rId6"/>
+                    <a:blip r:embed="rId7"/>
                     <a:stretch>
                       <a:fillRect/>
                     </a:stretch>
@@ -1157,7 +1197,7 @@
                     <pic:cNvPicPr/>
                   </pic:nvPicPr>
                   <pic:blipFill>
-                    <a:blip r:embed="rId7"/>
+                    <a:blip r:embed="rId8"/>
                     <a:stretch>
                       <a:fillRect/>
                     </a:stretch>
@@ -1210,7 +1250,7 @@
                     <pic:cNvPicPr/>
                   </pic:nvPicPr>
                   <pic:blipFill>
-                    <a:blip r:embed="rId8"/>
+                    <a:blip r:embed="rId9"/>
                     <a:stretch>
                       <a:fillRect/>
                     </a:stretch>
@@ -1247,7 +1287,7 @@
                     <pic:cNvPicPr/>
                   </pic:nvPicPr>
                   <pic:blipFill>
-                    <a:blip r:embed="rId9"/>
+                    <a:blip r:embed="rId10"/>
                     <a:stretch>
                       <a:fillRect/>
                     </a:stretch>
@@ -1300,7 +1340,7 @@
                     <pic:cNvPicPr/>
                   </pic:nvPicPr>
                   <pic:blipFill>
-                    <a:blip r:embed="rId10"/>
+                    <a:blip r:embed="rId11"/>
                     <a:stretch>
                       <a:fillRect/>
                     </a:stretch>
@@ -1342,7 +1382,7 @@
                     <pic:cNvPicPr/>
                   </pic:nvPicPr>
                   <pic:blipFill>
-                    <a:blip r:embed="rId11"/>
+                    <a:blip r:embed="rId12"/>
                     <a:stretch>
                       <a:fillRect/>
                     </a:stretch>
@@ -1687,7 +1727,7 @@
                     <pic:cNvPicPr/>
                   </pic:nvPicPr>
                   <pic:blipFill>
-                    <a:blip r:embed="rId12"/>
+                    <a:blip r:embed="rId13"/>
                     <a:stretch>
                       <a:fillRect/>
                     </a:stretch>
@@ -2931,6 +2971,18 @@
       </w:tblBorders>
     </w:tblPr>
   </w:style>
+  <w:style w:type="character" w:styleId="UnresolvedMention">
+    <w:name w:val="Unresolved Mention"/>
+    <w:basedOn w:val="DefaultParagraphFont"/>
+    <w:uiPriority w:val="99"/>
+    <w:semiHidden/>
+    <w:unhideWhenUsed/>
+    <w:rsid w:val="00F647A1"/>
+    <w:rPr>
+      <w:color w:val="605E5C"/>
+      <w:shd w:val="clear" w:color="auto" w:fill="E1DFDD"/>
+    </w:rPr>
+  </w:style>
 </w:styles>
 </file>
 

</xml_diff>